<commit_message>
deal screen: update atoms.docx
</commit_message>
<xml_diff>
--- a/hub/static/research/companies/atoms.docx
+++ b/hub/static/research/companies/atoms.docx
@@ -77,7 +77,7 @@
           <w:color w:val="1A1A1A"/>
           <w:sz w:val="32"/>
         </w:rPr>
-        <w:t>2.3 / 4.0</w:t>
+        <w:t>0.0 / 4.0</w:t>
       </w:r>
       <w:r>
         <w:rPr>
@@ -87,7 +87,7 @@
           <w:color w:val="828282"/>
           <w:sz w:val="21"/>
         </w:rPr>
-        <w:t xml:space="preserve">   (raw 2.3)</w:t>
+        <w:t xml:space="preserve">   (raw 0.0)</w:t>
       </w:r>
       <w:r>
         <w:rPr>
@@ -97,7 +97,7 @@
           <w:color w:val="828282"/>
           <w:sz w:val="21"/>
         </w:rPr>
-        <w:t xml:space="preserve">   —   PASS</w:t>
+        <w:t xml:space="preserve">   —   SCORING FAILED — NOT SCREENED</w:t>
       </w:r>
     </w:p>
     <w:tbl>
@@ -185,516 +185,6 @@
           </w:p>
         </w:tc>
       </w:tr>
-      <w:tr>
-        <w:tc>
-          <w:tcPr>
-            <w:tcW w:type="dxa" w:w="2664"/>
-            <w:shd w:val="clear" w:color="auto" w:fill="F5F5F5"/>
-            <w:tcMar>
-              <w:top w:w="40" w:type="dxa"/>
-              <w:bottom w:w="40" w:type="dxa"/>
-              <w:left w:w="60" w:type="dxa"/>
-              <w:right w:w="60" w:type="dxa"/>
-            </w:tcMar>
-            <w:tcBorders>
-              <w:top w:val="nil"/>
-              <w:left w:val="nil"/>
-              <w:right w:val="nil"/>
-              <w:bottom w:val="single" w:sz="4" w:color="E4DFD5"/>
-            </w:tcBorders>
-          </w:tcPr>
-          <w:p>
-            <w:r>
-              <w:rPr>
-                <w:rFonts w:ascii="Sora" w:hAnsi="Sora"/>
-                <w:b w:val="0"/>
-                <w:caps w:val="0"/>
-                <w:color w:val="1A1A1A"/>
-                <w:sz w:val="19"/>
-              </w:rPr>
-              <w:t>Lead / Round Dynamics</w:t>
-            </w:r>
-          </w:p>
-        </w:tc>
-        <w:tc>
-          <w:tcPr>
-            <w:tcW w:type="dxa" w:w="792"/>
-            <w:shd w:val="clear" w:color="auto" w:fill="F5F5F5"/>
-            <w:tcMar>
-              <w:top w:w="40" w:type="dxa"/>
-              <w:bottom w:w="40" w:type="dxa"/>
-              <w:left w:w="60" w:type="dxa"/>
-              <w:right w:w="60" w:type="dxa"/>
-            </w:tcMar>
-            <w:tcBorders>
-              <w:top w:val="nil"/>
-              <w:left w:val="nil"/>
-              <w:right w:val="nil"/>
-              <w:bottom w:val="single" w:sz="4" w:color="E4DFD5"/>
-            </w:tcBorders>
-          </w:tcPr>
-          <w:p>
-            <w:r>
-              <w:rPr>
-                <w:rFonts w:ascii="Sora" w:hAnsi="Sora"/>
-                <w:b/>
-                <w:caps w:val="0"/>
-                <w:color w:val="1A1A1A"/>
-                <w:sz w:val="19"/>
-              </w:rPr>
-              <w:t>2.8</w:t>
-            </w:r>
-            <w:r>
-              <w:rPr>
-                <w:rFonts w:ascii="Sora" w:hAnsi="Sora"/>
-                <w:b w:val="0"/>
-                <w:caps w:val="0"/>
-                <w:color w:val="828282"/>
-                <w:sz w:val="17"/>
-              </w:rPr>
-              <w:t xml:space="preserve"> / 4</w:t>
-            </w:r>
-          </w:p>
-        </w:tc>
-        <w:tc>
-          <w:tcPr>
-            <w:tcW w:type="dxa" w:w="5904"/>
-            <w:shd w:val="clear" w:color="auto" w:fill="F5F5F5"/>
-            <w:tcMar>
-              <w:top w:w="40" w:type="dxa"/>
-              <w:bottom w:w="40" w:type="dxa"/>
-              <w:left w:w="60" w:type="dxa"/>
-              <w:right w:w="60" w:type="dxa"/>
-            </w:tcMar>
-            <w:tcBorders>
-              <w:top w:val="nil"/>
-              <w:left w:val="nil"/>
-              <w:right w:val="nil"/>
-              <w:bottom w:val="single" w:sz="4" w:color="E4DFD5"/>
-            </w:tcBorders>
-          </w:tcPr>
-          <w:p>
-            <w:r>
-              <w:rPr>
-                <w:rFonts w:ascii="Sora" w:hAnsi="Sora"/>
-                <w:b w:val="0"/>
-                <w:caps w:val="0"/>
-                <w:color w:val="3C3C3C"/>
-                <w:sz w:val="18"/>
-              </w:rPr>
-              <w:t>New-money Tier 1 lead at growth stage with strong partner conviction, but limited signal on prior-investor follow-on or domain-strategic validation.</w:t>
-            </w:r>
-          </w:p>
-        </w:tc>
-      </w:tr>
-      <w:tr>
-        <w:tc>
-          <w:tcPr>
-            <w:tcW w:type="dxa" w:w="2664"/>
-            <w:shd w:val="clear" w:color="auto" w:fill="FFFFFF"/>
-            <w:tcMar>
-              <w:top w:w="40" w:type="dxa"/>
-              <w:bottom w:w="40" w:type="dxa"/>
-              <w:left w:w="60" w:type="dxa"/>
-              <w:right w:w="60" w:type="dxa"/>
-            </w:tcMar>
-            <w:tcBorders>
-              <w:top w:val="nil"/>
-              <w:left w:val="nil"/>
-              <w:right w:val="nil"/>
-              <w:bottom w:val="single" w:sz="4" w:color="E4DFD5"/>
-            </w:tcBorders>
-          </w:tcPr>
-          <w:p>
-            <w:r>
-              <w:rPr>
-                <w:rFonts w:ascii="Sora" w:hAnsi="Sora"/>
-                <w:b w:val="0"/>
-                <w:caps w:val="0"/>
-                <w:color w:val="1A1A1A"/>
-                <w:sz w:val="19"/>
-              </w:rPr>
-              <w:t>AI Score</w:t>
-            </w:r>
-          </w:p>
-        </w:tc>
-        <w:tc>
-          <w:tcPr>
-            <w:tcW w:type="dxa" w:w="792"/>
-            <w:shd w:val="clear" w:color="auto" w:fill="FFFFFF"/>
-            <w:tcMar>
-              <w:top w:w="40" w:type="dxa"/>
-              <w:bottom w:w="40" w:type="dxa"/>
-              <w:left w:w="60" w:type="dxa"/>
-              <w:right w:w="60" w:type="dxa"/>
-            </w:tcMar>
-            <w:tcBorders>
-              <w:top w:val="nil"/>
-              <w:left w:val="nil"/>
-              <w:right w:val="nil"/>
-              <w:bottom w:val="single" w:sz="4" w:color="E4DFD5"/>
-            </w:tcBorders>
-          </w:tcPr>
-          <w:p>
-            <w:r>
-              <w:rPr>
-                <w:rFonts w:ascii="Sora" w:hAnsi="Sora"/>
-                <w:b/>
-                <w:caps w:val="0"/>
-                <w:color w:val="1A1A1A"/>
-                <w:sz w:val="19"/>
-              </w:rPr>
-              <w:t>3.0</w:t>
-            </w:r>
-            <w:r>
-              <w:rPr>
-                <w:rFonts w:ascii="Sora" w:hAnsi="Sora"/>
-                <w:b w:val="0"/>
-                <w:caps w:val="0"/>
-                <w:color w:val="828282"/>
-                <w:sz w:val="17"/>
-              </w:rPr>
-              <w:t xml:space="preserve"> / 4</w:t>
-            </w:r>
-          </w:p>
-        </w:tc>
-        <w:tc>
-          <w:tcPr>
-            <w:tcW w:type="dxa" w:w="5904"/>
-            <w:shd w:val="clear" w:color="auto" w:fill="FFFFFF"/>
-            <w:tcMar>
-              <w:top w:w="40" w:type="dxa"/>
-              <w:bottom w:w="40" w:type="dxa"/>
-              <w:left w:w="60" w:type="dxa"/>
-              <w:right w:w="60" w:type="dxa"/>
-            </w:tcMar>
-            <w:tcBorders>
-              <w:top w:val="nil"/>
-              <w:left w:val="nil"/>
-              <w:right w:val="nil"/>
-              <w:bottom w:val="single" w:sz="4" w:color="E4DFD5"/>
-            </w:tcBorders>
-          </w:tcPr>
-          <w:p>
-            <w:r>
-              <w:rPr>
-                <w:rFonts w:ascii="Sora" w:hAnsi="Sora"/>
-                <w:b w:val="0"/>
-                <w:caps w:val="0"/>
-                <w:color w:val="3C3C3C"/>
-                <w:sz w:val="18"/>
-              </w:rPr>
-              <w:t>Physical-automation platform appears genuinely AI-driven, with proprietary robotics stack and data feedback loops, though detailed model architecture and retraining cadence remain undisclosed.</w:t>
-            </w:r>
-          </w:p>
-        </w:tc>
-      </w:tr>
-      <w:tr>
-        <w:tc>
-          <w:tcPr>
-            <w:tcW w:type="dxa" w:w="2664"/>
-            <w:shd w:val="clear" w:color="auto" w:fill="F5F5F5"/>
-            <w:tcMar>
-              <w:top w:w="40" w:type="dxa"/>
-              <w:bottom w:w="40" w:type="dxa"/>
-              <w:left w:w="60" w:type="dxa"/>
-              <w:right w:w="60" w:type="dxa"/>
-            </w:tcMar>
-            <w:tcBorders>
-              <w:top w:val="nil"/>
-              <w:left w:val="nil"/>
-              <w:right w:val="nil"/>
-              <w:bottom w:val="single" w:sz="4" w:color="E4DFD5"/>
-            </w:tcBorders>
-          </w:tcPr>
-          <w:p>
-            <w:r>
-              <w:rPr>
-                <w:rFonts w:ascii="Sora" w:hAnsi="Sora"/>
-                <w:b w:val="0"/>
-                <w:caps w:val="0"/>
-                <w:color w:val="1A1A1A"/>
-                <w:sz w:val="19"/>
-              </w:rPr>
-              <w:t>Terms</w:t>
-            </w:r>
-          </w:p>
-        </w:tc>
-        <w:tc>
-          <w:tcPr>
-            <w:tcW w:type="dxa" w:w="792"/>
-            <w:shd w:val="clear" w:color="auto" w:fill="F5F5F5"/>
-            <w:tcMar>
-              <w:top w:w="40" w:type="dxa"/>
-              <w:bottom w:w="40" w:type="dxa"/>
-              <w:left w:w="60" w:type="dxa"/>
-              <w:right w:w="60" w:type="dxa"/>
-            </w:tcMar>
-            <w:tcBorders>
-              <w:top w:val="nil"/>
-              <w:left w:val="nil"/>
-              <w:right w:val="nil"/>
-              <w:bottom w:val="single" w:sz="4" w:color="E4DFD5"/>
-            </w:tcBorders>
-          </w:tcPr>
-          <w:p>
-            <w:r>
-              <w:rPr>
-                <w:rFonts w:ascii="Sora" w:hAnsi="Sora"/>
-                <w:b/>
-                <w:caps w:val="0"/>
-                <w:color w:val="1A1A1A"/>
-                <w:sz w:val="19"/>
-              </w:rPr>
-              <w:t>3.0</w:t>
-            </w:r>
-            <w:r>
-              <w:rPr>
-                <w:rFonts w:ascii="Sora" w:hAnsi="Sora"/>
-                <w:b w:val="0"/>
-                <w:caps w:val="0"/>
-                <w:color w:val="828282"/>
-                <w:sz w:val="17"/>
-              </w:rPr>
-              <w:t xml:space="preserve"> / 4</w:t>
-            </w:r>
-          </w:p>
-        </w:tc>
-        <w:tc>
-          <w:tcPr>
-            <w:tcW w:type="dxa" w:w="5904"/>
-            <w:shd w:val="clear" w:color="auto" w:fill="F5F5F5"/>
-            <w:tcMar>
-              <w:top w:w="40" w:type="dxa"/>
-              <w:bottom w:w="40" w:type="dxa"/>
-              <w:left w:w="60" w:type="dxa"/>
-              <w:right w:w="60" w:type="dxa"/>
-            </w:tcMar>
-            <w:tcBorders>
-              <w:top w:val="nil"/>
-              <w:left w:val="nil"/>
-              <w:right w:val="nil"/>
-              <w:bottom w:val="single" w:sz="4" w:color="E4DFD5"/>
-            </w:tcBorders>
-          </w:tcPr>
-          <w:p>
-            <w:r>
-              <w:rPr>
-                <w:rFonts w:ascii="Sora" w:hAnsi="Sora"/>
-                <w:b w:val="0"/>
-                <w:caps w:val="0"/>
-                <w:color w:val="3C3C3C"/>
-                <w:sz w:val="18"/>
-              </w:rPr>
-              <w:t>Deal terms are undisclosed; absent any adverse public signal, co-invest structure and economics are assumed standard and acceptable.</w:t>
-            </w:r>
-          </w:p>
-        </w:tc>
-      </w:tr>
-      <w:tr>
-        <w:tc>
-          <w:tcPr>
-            <w:tcW w:type="dxa" w:w="2664"/>
-            <w:shd w:val="clear" w:color="auto" w:fill="FFFFFF"/>
-            <w:tcMar>
-              <w:top w:w="40" w:type="dxa"/>
-              <w:bottom w:w="40" w:type="dxa"/>
-              <w:left w:w="60" w:type="dxa"/>
-              <w:right w:w="60" w:type="dxa"/>
-            </w:tcMar>
-            <w:tcBorders>
-              <w:top w:val="nil"/>
-              <w:left w:val="nil"/>
-              <w:right w:val="nil"/>
-              <w:bottom w:val="single" w:sz="4" w:color="E4DFD5"/>
-            </w:tcBorders>
-          </w:tcPr>
-          <w:p>
-            <w:r>
-              <w:rPr>
-                <w:rFonts w:ascii="Sora" w:hAnsi="Sora"/>
-                <w:b w:val="0"/>
-                <w:caps w:val="0"/>
-                <w:color w:val="1A1A1A"/>
-                <w:sz w:val="19"/>
-              </w:rPr>
-              <w:t>Fundamentals</w:t>
-            </w:r>
-          </w:p>
-        </w:tc>
-        <w:tc>
-          <w:tcPr>
-            <w:tcW w:type="dxa" w:w="792"/>
-            <w:shd w:val="clear" w:color="auto" w:fill="FFFFFF"/>
-            <w:tcMar>
-              <w:top w:w="40" w:type="dxa"/>
-              <w:bottom w:w="40" w:type="dxa"/>
-              <w:left w:w="60" w:type="dxa"/>
-              <w:right w:w="60" w:type="dxa"/>
-            </w:tcMar>
-            <w:tcBorders>
-              <w:top w:val="nil"/>
-              <w:left w:val="nil"/>
-              <w:right w:val="nil"/>
-              <w:bottom w:val="single" w:sz="4" w:color="E4DFD5"/>
-            </w:tcBorders>
-          </w:tcPr>
-          <w:p>
-            <w:r>
-              <w:rPr>
-                <w:rFonts w:ascii="Sora" w:hAnsi="Sora"/>
-                <w:b/>
-                <w:caps w:val="0"/>
-                <w:color w:val="1A1A1A"/>
-                <w:sz w:val="19"/>
-              </w:rPr>
-              <w:t>2.4</w:t>
-            </w:r>
-            <w:r>
-              <w:rPr>
-                <w:rFonts w:ascii="Sora" w:hAnsi="Sora"/>
-                <w:b w:val="0"/>
-                <w:caps w:val="0"/>
-                <w:color w:val="828282"/>
-                <w:sz w:val="17"/>
-              </w:rPr>
-              <w:t xml:space="preserve"> / 4</w:t>
-            </w:r>
-          </w:p>
-        </w:tc>
-        <w:tc>
-          <w:tcPr>
-            <w:tcW w:type="dxa" w:w="5904"/>
-            <w:shd w:val="clear" w:color="auto" w:fill="FFFFFF"/>
-            <w:tcMar>
-              <w:top w:w="40" w:type="dxa"/>
-              <w:bottom w:w="40" w:type="dxa"/>
-              <w:left w:w="60" w:type="dxa"/>
-              <w:right w:w="60" w:type="dxa"/>
-            </w:tcMar>
-            <w:tcBorders>
-              <w:top w:val="nil"/>
-              <w:left w:val="nil"/>
-              <w:right w:val="nil"/>
-              <w:bottom w:val="single" w:sz="4" w:color="E4DFD5"/>
-            </w:tcBorders>
-          </w:tcPr>
-          <w:p>
-            <w:r>
-              <w:rPr>
-                <w:rFonts w:ascii="Sora" w:hAnsi="Sora"/>
-                <w:b w:val="0"/>
-                <w:caps w:val="0"/>
-                <w:color w:val="3C3C3C"/>
-                <w:sz w:val="18"/>
-              </w:rPr>
-              <w:t>Fundamentals show enormous TAM and structural moat potential, but key financial metrics, capital efficiency, customer diversification, and valuation multiples remain undisclosed at this stage.</w:t>
-            </w:r>
-          </w:p>
-        </w:tc>
-      </w:tr>
-      <w:tr>
-        <w:tc>
-          <w:tcPr>
-            <w:tcW w:type="dxa" w:w="2664"/>
-            <w:shd w:val="clear" w:color="auto" w:fill="F5F5F5"/>
-            <w:tcMar>
-              <w:top w:w="40" w:type="dxa"/>
-              <w:bottom w:w="40" w:type="dxa"/>
-              <w:left w:w="60" w:type="dxa"/>
-              <w:right w:w="60" w:type="dxa"/>
-            </w:tcMar>
-            <w:tcBorders>
-              <w:top w:val="nil"/>
-              <w:left w:val="nil"/>
-              <w:right w:val="nil"/>
-              <w:bottom w:val="single" w:sz="4" w:color="E4DFD5"/>
-            </w:tcBorders>
-          </w:tcPr>
-          <w:p>
-            <w:r>
-              <w:rPr>
-                <w:rFonts w:ascii="Sora" w:hAnsi="Sora"/>
-                <w:b w:val="0"/>
-                <w:caps w:val="0"/>
-                <w:color w:val="1A1A1A"/>
-                <w:sz w:val="19"/>
-              </w:rPr>
-              <w:t>Return Potential</w:t>
-            </w:r>
-          </w:p>
-        </w:tc>
-        <w:tc>
-          <w:tcPr>
-            <w:tcW w:type="dxa" w:w="792"/>
-            <w:shd w:val="clear" w:color="auto" w:fill="F5F5F5"/>
-            <w:tcMar>
-              <w:top w:w="40" w:type="dxa"/>
-              <w:bottom w:w="40" w:type="dxa"/>
-              <w:left w:w="60" w:type="dxa"/>
-              <w:right w:w="60" w:type="dxa"/>
-            </w:tcMar>
-            <w:tcBorders>
-              <w:top w:val="nil"/>
-              <w:left w:val="nil"/>
-              <w:right w:val="nil"/>
-              <w:bottom w:val="single" w:sz="4" w:color="E4DFD5"/>
-            </w:tcBorders>
-          </w:tcPr>
-          <w:p>
-            <w:r>
-              <w:rPr>
-                <w:rFonts w:ascii="Sora" w:hAnsi="Sora"/>
-                <w:b/>
-                <w:caps w:val="0"/>
-                <w:color w:val="1A1A1A"/>
-                <w:sz w:val="19"/>
-              </w:rPr>
-              <w:t>2.8</w:t>
-            </w:r>
-            <w:r>
-              <w:rPr>
-                <w:rFonts w:ascii="Sora" w:hAnsi="Sora"/>
-                <w:b w:val="0"/>
-                <w:caps w:val="0"/>
-                <w:color w:val="828282"/>
-                <w:sz w:val="17"/>
-              </w:rPr>
-              <w:t xml:space="preserve"> / 4</w:t>
-            </w:r>
-          </w:p>
-        </w:tc>
-        <w:tc>
-          <w:tcPr>
-            <w:tcW w:type="dxa" w:w="5904"/>
-            <w:shd w:val="clear" w:color="auto" w:fill="F5F5F5"/>
-            <w:tcMar>
-              <w:top w:w="40" w:type="dxa"/>
-              <w:bottom w:w="40" w:type="dxa"/>
-              <w:left w:w="60" w:type="dxa"/>
-              <w:right w:w="60" w:type="dxa"/>
-            </w:tcMar>
-            <w:tcBorders>
-              <w:top w:val="nil"/>
-              <w:left w:val="nil"/>
-              <w:right w:val="nil"/>
-              <w:bottom w:val="single" w:sz="4" w:color="E4DFD5"/>
-            </w:tcBorders>
-          </w:tcPr>
-          <w:p>
-            <w:r>
-              <w:rPr>
-                <w:rFonts w:ascii="Sora" w:hAnsi="Sora"/>
-                <w:b w:val="0"/>
-                <w:caps w:val="0"/>
-                <w:color w:val="3C3C3C"/>
-                <w:sz w:val="18"/>
-              </w:rPr>
-              <w:t>Return potential could be strong if Atoms becomes a core industrial-AI platform, but unknown entry valuation and long buildout timeline temper conviction.</w:t>
-            </w:r>
-          </w:p>
-        </w:tc>
-      </w:tr>
     </w:tbl>
     <w:p>
       <w:pPr>
@@ -732,7 +222,7 @@
           <w:color w:val="1A1A1A"/>
           <w:sz w:val="21"/>
         </w:rPr>
-        <w:t>Atoms aligns with ID8’s thesis: a new-money Tier 1 lead and a genuinely AI-centric industrial automation moat. Data gaps on fundamentals and valuation mean the fit looks promising but requires deeper diligence.</w:t>
+        <w:t>scoring failed: 401 Client Error: Unauthorized for url: https://api.perplexity.ai/chat/completions</w:t>
       </w:r>
     </w:p>
     <w:p>
@@ -747,7 +237,7 @@
           <w:color w:val="828282"/>
           <w:sz w:val="18"/>
         </w:rPr>
-        <w:t>Confidence: medium</w:t>
+        <w:t>Confidence: low</w:t>
       </w:r>
     </w:p>
     <w:sectPr>

</xml_diff>